<commit_message>
Harden live chat connections
</commit_message>
<xml_diff>
--- a/Documents/Nexus Technical Improvements.docx
+++ b/Documents/Nexus Technical Improvements.docx
@@ -2995,60 +2995,12 @@
             </w:tcMar>
           </w:tcPr>
           <w:p>
-            <w:pPr>
-              <w:spacing w:after="60"/>
-            </w:pPr>
-            <w:r>
-              <w:rPr>
-                <w:rFonts w:ascii="Segoe UI Symbol" w:hAnsi="Segoe UI Symbol"/>
-                <w:sz w:val="18"/>
-              </w:rPr>
-              <w:t xml:space="preserve">☐ </w:t>
-            </w:r>
-            <w:r>
-              <w:rPr>
-                <w:rFonts w:ascii="Arial" w:hAnsi="Arial"/>
-                <w:sz w:val="18"/>
-              </w:rPr>
-              <w:t>Close a member's connections on removal or role change</w:t>
-            </w:r>
-          </w:p>
-          <w:p>
-            <w:pPr>
-              <w:spacing w:after="60"/>
-            </w:pPr>
-            <w:r>
-              <w:rPr>
-                <w:rFonts w:ascii="Segoe UI Symbol" w:hAnsi="Segoe UI Symbol"/>
-                <w:sz w:val="18"/>
-              </w:rPr>
-              <w:t xml:space="preserve">☐ </w:t>
-            </w:r>
-            <w:r>
-              <w:rPr>
-                <w:rFonts w:ascii="Arial" w:hAnsi="Arial"/>
-                <w:sz w:val="18"/>
-              </w:rPr>
-              <w:t>per-connection message rate limit</w:t>
-            </w:r>
-          </w:p>
-          <w:p>
-            <w:pPr>
-              <w:spacing w:after="60"/>
-            </w:pPr>
-            <w:r>
-              <w:rPr>
-                <w:rFonts w:ascii="Segoe UI Symbol" w:hAnsi="Segoe UI Symbol"/>
-                <w:sz w:val="18"/>
-              </w:rPr>
-              <w:t xml:space="preserve">☐ </w:t>
-            </w:r>
-            <w:r>
-              <w:rPr>
-                <w:rFonts w:ascii="Arial" w:hAnsi="Arial"/>
-                <w:sz w:val="18"/>
-              </w:rPr>
-              <w:t>re-check the session on idle connections.</w:t>
+            <w:r>
+              <w:t>☑ Close a member's connections on removal or role change</w:t>
+              <w:br/>
+              <w:t>☑ per-connection message rate limit</w:t>
+              <w:br/>
+              <w:t>☑ re-check the session on idle connections.</w:t>
             </w:r>
           </w:p>
         </w:tc>

</xml_diff>

<commit_message>
Security scopes 11 and 12: memory change review, task audit log, CSV formula guard, browser security headers, ZAP baseline
</commit_message>
<xml_diff>
--- a/Documents/Nexus Technical Improvements.docx
+++ b/Documents/Nexus Technical Improvements.docx
@@ -207,6 +207,13 @@
           <w:p>
             <w:r>
               <w:rPr>
+                <w:rFonts w:ascii="Segoe UI Symbol" w:hAnsi="Segoe UI Symbol"/>
+                <w:sz w:val="18"/>
+              </w:rPr>
+              <w:t xml:space="preserve">☐ </w:t>
+            </w:r>
+            <w:r>
+              <w:rPr>
                 <w:b/>
                 <w:bCs/>
               </w:rPr>
@@ -283,6 +290,13 @@
           <w:p>
             <w:r>
               <w:rPr>
+                <w:rFonts w:ascii="Segoe UI Symbol" w:hAnsi="Segoe UI Symbol"/>
+                <w:sz w:val="18"/>
+              </w:rPr>
+              <w:t xml:space="preserve">☐ </w:t>
+            </w:r>
+            <w:r>
+              <w:rPr>
                 <w:b/>
                 <w:bCs/>
               </w:rPr>
@@ -360,6 +374,13 @@
           <w:p>
             <w:r>
               <w:rPr>
+                <w:rFonts w:ascii="Segoe UI Symbol" w:hAnsi="Segoe UI Symbol"/>
+                <w:sz w:val="18"/>
+              </w:rPr>
+              <w:t xml:space="preserve">☑ </w:t>
+            </w:r>
+            <w:r>
+              <w:rPr>
                 <w:b/>
                 <w:bCs/>
               </w:rPr>
@@ -434,6 +455,13 @@
             </w:tcMar>
           </w:tcPr>
           <w:p>
+            <w:r>
+              <w:rPr>
+                <w:rFonts w:ascii="Segoe UI Symbol" w:hAnsi="Segoe UI Symbol"/>
+                <w:sz w:val="18"/>
+              </w:rPr>
+              <w:t xml:space="preserve">☑ </w:t>
+            </w:r>
             <w:r>
               <w:rPr>
                 <w:b/>
@@ -642,6 +670,13 @@
           <w:p>
             <w:r>
               <w:rPr>
+                <w:rFonts w:ascii="Segoe UI Symbol" w:hAnsi="Segoe UI Symbol"/>
+                <w:sz w:val="18"/>
+              </w:rPr>
+              <w:t xml:space="preserve">☐ </w:t>
+            </w:r>
+            <w:r>
+              <w:rPr>
                 <w:b/>
                 <w:bCs/>
               </w:rPr>
@@ -718,6 +753,13 @@
           <w:p>
             <w:r>
               <w:rPr>
+                <w:rFonts w:ascii="Segoe UI Symbol" w:hAnsi="Segoe UI Symbol"/>
+                <w:sz w:val="18"/>
+              </w:rPr>
+              <w:t xml:space="preserve">☐ </w:t>
+            </w:r>
+            <w:r>
+              <w:rPr>
                 <w:b/>
                 <w:bCs/>
               </w:rPr>
@@ -803,6 +845,13 @@
           <w:p>
             <w:r>
               <w:rPr>
+                <w:rFonts w:ascii="Segoe UI Symbol" w:hAnsi="Segoe UI Symbol"/>
+                <w:sz w:val="18"/>
+              </w:rPr>
+              <w:t xml:space="preserve">☐ </w:t>
+            </w:r>
+            <w:r>
+              <w:rPr>
                 <w:b/>
                 <w:bCs/>
               </w:rPr>
@@ -879,6 +928,13 @@
           <w:p>
             <w:r>
               <w:rPr>
+                <w:rFonts w:ascii="Segoe UI Symbol" w:hAnsi="Segoe UI Symbol"/>
+                <w:sz w:val="18"/>
+              </w:rPr>
+              <w:t xml:space="preserve">☐ </w:t>
+            </w:r>
+            <w:r>
+              <w:rPr>
                 <w:b/>
                 <w:bCs/>
               </w:rPr>
@@ -954,6 +1010,13 @@
             </w:tcMar>
           </w:tcPr>
           <w:p>
+            <w:r>
+              <w:rPr>
+                <w:rFonts w:ascii="Segoe UI Symbol" w:hAnsi="Segoe UI Symbol"/>
+                <w:sz w:val="18"/>
+              </w:rPr>
+              <w:t xml:space="preserve">☐ </w:t>
+            </w:r>
             <w:r>
               <w:rPr>
                 <w:b/>
@@ -1160,6 +1223,13 @@
           <w:p>
             <w:r>
               <w:rPr>
+                <w:rFonts w:ascii="Segoe UI Symbol" w:hAnsi="Segoe UI Symbol"/>
+                <w:sz w:val="18"/>
+              </w:rPr>
+              <w:t xml:space="preserve">☐ </w:t>
+            </w:r>
+            <w:r>
+              <w:rPr>
                 <w:b/>
                 <w:bCs/>
               </w:rPr>
@@ -1236,6 +1306,13 @@
           <w:p>
             <w:r>
               <w:rPr>
+                <w:rFonts w:ascii="Segoe UI Symbol" w:hAnsi="Segoe UI Symbol"/>
+                <w:sz w:val="18"/>
+              </w:rPr>
+              <w:t xml:space="preserve">☐ </w:t>
+            </w:r>
+            <w:r>
+              <w:rPr>
                 <w:b/>
                 <w:bCs/>
               </w:rPr>
@@ -1313,6 +1390,13 @@
           <w:p>
             <w:r>
               <w:rPr>
+                <w:rFonts w:ascii="Segoe UI Symbol" w:hAnsi="Segoe UI Symbol"/>
+                <w:sz w:val="18"/>
+              </w:rPr>
+              <w:t xml:space="preserve">☐ </w:t>
+            </w:r>
+            <w:r>
+              <w:rPr>
                 <w:b/>
                 <w:bCs/>
               </w:rPr>
@@ -1387,6 +1471,13 @@
             </w:tcMar>
           </w:tcPr>
           <w:p>
+            <w:r>
+              <w:rPr>
+                <w:rFonts w:ascii="Segoe UI Symbol" w:hAnsi="Segoe UI Symbol"/>
+                <w:sz w:val="18"/>
+              </w:rPr>
+              <w:t xml:space="preserve">☐ </w:t>
+            </w:r>
             <w:r>
               <w:rPr>
                 <w:b/>
@@ -1596,6 +1687,13 @@
           <w:p>
             <w:r>
               <w:rPr>
+                <w:rFonts w:ascii="Segoe UI Symbol" w:hAnsi="Segoe UI Symbol"/>
+                <w:sz w:val="18"/>
+              </w:rPr>
+              <w:t xml:space="preserve">☑ </w:t>
+            </w:r>
+            <w:r>
+              <w:rPr>
                 <w:b/>
                 <w:bCs/>
               </w:rPr>
@@ -1672,6 +1770,13 @@
           <w:p>
             <w:r>
               <w:rPr>
+                <w:rFonts w:ascii="Segoe UI Symbol" w:hAnsi="Segoe UI Symbol"/>
+                <w:sz w:val="18"/>
+              </w:rPr>
+              <w:t xml:space="preserve">☑ </w:t>
+            </w:r>
+            <w:r>
+              <w:rPr>
                 <w:b/>
                 <w:bCs/>
               </w:rPr>
@@ -1749,6 +1854,13 @@
           <w:p>
             <w:r>
               <w:rPr>
+                <w:rFonts w:ascii="Segoe UI Symbol" w:hAnsi="Segoe UI Symbol"/>
+                <w:sz w:val="18"/>
+              </w:rPr>
+              <w:t xml:space="preserve">☑ </w:t>
+            </w:r>
+            <w:r>
+              <w:rPr>
                 <w:b/>
                 <w:bCs/>
               </w:rPr>
@@ -1831,6 +1943,13 @@
             </w:tcMar>
           </w:tcPr>
           <w:p>
+            <w:r>
+              <w:rPr>
+                <w:rFonts w:ascii="Segoe UI Symbol" w:hAnsi="Segoe UI Symbol"/>
+                <w:sz w:val="18"/>
+              </w:rPr>
+              <w:t xml:space="preserve">☑ </w:t>
+            </w:r>
             <w:r>
               <w:rPr>
                 <w:b/>
@@ -2367,7 +2486,7 @@
                 <w:rFonts w:ascii="Arial" w:hAnsi="Arial"/>
                 <w:sz w:val="18"/>
               </w:rPr>
-              <w:t>Generic login and sign-up errors</w:t>
+              <w:t xml:space="preserve">Generic login and sign-up errors</w:t>
             </w:r>
           </w:p>
           <w:p>
@@ -2386,7 +2505,7 @@
                 <w:rFonts w:ascii="Arial" w:hAnsi="Arial"/>
                 <w:sz w:val="18"/>
               </w:rPr>
-              <w:t>turn on email verification</w:t>
+              <w:t xml:space="preserve">turn on email verification</w:t>
             </w:r>
           </w:p>
           <w:p>
@@ -2405,7 +2524,7 @@
                 <w:rFonts w:ascii="Arial" w:hAnsi="Arial"/>
                 <w:sz w:val="18"/>
               </w:rPr>
-              <w:t>session list with revoke-all</w:t>
+              <w:t xml:space="preserve">session list with revoke-all</w:t>
             </w:r>
           </w:p>
           <w:p>
@@ -2424,7 +2543,7 @@
                 <w:rFonts w:ascii="Arial" w:hAnsi="Arial"/>
                 <w:sz w:val="18"/>
               </w:rPr>
-              <w:t>regularly delete expired sessions.</w:t>
+              <w:t xml:space="preserve">regularly delete expired sessions.</w:t>
             </w:r>
           </w:p>
         </w:tc>
@@ -2590,7 +2709,7 @@
                 <w:rFonts w:ascii="Arial" w:hAnsi="Arial"/>
                 <w:sz w:val="18"/>
               </w:rPr>
-              <w:t>Rotate the code (automatically on removal) and optionally require Admin approval to join</w:t>
+              <w:t xml:space="preserve">Rotate the code (automatically on removal) and optionally require Admin approval to join</w:t>
             </w:r>
           </w:p>
           <w:p>
@@ -2609,7 +2728,7 @@
                 <w:rFonts w:ascii="Arial" w:hAnsi="Arial"/>
                 <w:sz w:val="18"/>
               </w:rPr>
-              <w:t>log membership changes</w:t>
+              <w:t xml:space="preserve">log membership changes</w:t>
             </w:r>
           </w:p>
           <w:p>
@@ -2621,14 +2740,14 @@
                 <w:rFonts w:ascii="Segoe UI Symbol" w:hAnsi="Segoe UI Symbol"/>
                 <w:sz w:val="18"/>
               </w:rPr>
-              <w:t xml:space="preserve">☑ </w:t>
+              <w:t xml:space="preserve">☐ </w:t>
             </w:r>
             <w:r>
               <w:rPr>
                 <w:rFonts w:ascii="Arial" w:hAnsi="Arial"/>
                 <w:sz w:val="18"/>
               </w:rPr>
-              <w:t>automated test that every route refuses other workspaces' IDs.</w:t>
+              <w:t xml:space="preserve">automated test that every route refuses other workspaces' IDs.</w:t>
             </w:r>
           </w:p>
         </w:tc>
@@ -2790,7 +2909,7 @@
                 <w:rFonts w:ascii="Arial" w:hAnsi="Arial"/>
                 <w:sz w:val="18"/>
               </w:rPr>
-              <w:t>Per-person permission grants</w:t>
+              <w:t xml:space="preserve">Per-person permission grants</w:t>
             </w:r>
           </w:p>
           <w:p>
@@ -2809,7 +2928,7 @@
                 <w:rFonts w:ascii="Arial" w:hAnsi="Arial"/>
                 <w:sz w:val="18"/>
               </w:rPr>
-              <w:t>owner-or-Admin rule for editing agents and workflows</w:t>
+              <w:t xml:space="preserve">owner-or-Admin rule for editing agents and workflows</w:t>
             </w:r>
           </w:p>
           <w:p>
@@ -2828,7 +2947,7 @@
                 <w:rFonts w:ascii="Arial" w:hAnsi="Arial"/>
                 <w:sz w:val="18"/>
               </w:rPr>
-              <w:t>turn the Role Access Matrix into table-driven tests.</w:t>
+              <w:t xml:space="preserve">turn the Role Access Matrix into table-driven tests.</w:t>
             </w:r>
           </w:p>
         </w:tc>
@@ -2995,12 +3114,60 @@
             </w:tcMar>
           </w:tcPr>
           <w:p>
-            <w:r>
-              <w:t>☑ Close a member's connections on removal or role change</w:t>
-              <w:br/>
-              <w:t>☑ per-connection message rate limit</w:t>
-              <w:br/>
-              <w:t>☑ re-check the session on idle connections.</w:t>
+            <w:pPr>
+              <w:spacing w:after="60"/>
+            </w:pPr>
+            <w:r>
+              <w:rPr>
+                <w:rFonts w:ascii="Segoe UI Symbol" w:hAnsi="Segoe UI Symbol"/>
+                <w:sz w:val="18"/>
+              </w:rPr>
+              <w:t xml:space="preserve">☑ </w:t>
+            </w:r>
+            <w:r>
+              <w:rPr>
+                <w:rFonts w:ascii="Arial" w:hAnsi="Arial"/>
+                <w:sz w:val="18"/>
+              </w:rPr>
+              <w:t xml:space="preserve">Close a member's connections on removal or role change</w:t>
+            </w:r>
+          </w:p>
+          <w:p>
+            <w:pPr>
+              <w:spacing w:after="60"/>
+            </w:pPr>
+            <w:r>
+              <w:rPr>
+                <w:rFonts w:ascii="Segoe UI Symbol" w:hAnsi="Segoe UI Symbol"/>
+                <w:sz w:val="18"/>
+              </w:rPr>
+              <w:t xml:space="preserve">☑ </w:t>
+            </w:r>
+            <w:r>
+              <w:rPr>
+                <w:rFonts w:ascii="Arial" w:hAnsi="Arial"/>
+                <w:sz w:val="18"/>
+              </w:rPr>
+              <w:t xml:space="preserve">per-connection message rate limit</w:t>
+            </w:r>
+          </w:p>
+          <w:p>
+            <w:pPr>
+              <w:spacing w:after="60"/>
+            </w:pPr>
+            <w:r>
+              <w:rPr>
+                <w:rFonts w:ascii="Segoe UI Symbol" w:hAnsi="Segoe UI Symbol"/>
+                <w:sz w:val="18"/>
+              </w:rPr>
+              <w:t xml:space="preserve">☑ </w:t>
+            </w:r>
+            <w:r>
+              <w:rPr>
+                <w:rFonts w:ascii="Arial" w:hAnsi="Arial"/>
+                <w:sz w:val="18"/>
+              </w:rPr>
+              <w:t xml:space="preserve">re-check the session on idle connections.</w:t>
             </w:r>
           </w:p>
         </w:tc>
@@ -3155,6 +3322,44 @@
                 <w:rFonts w:ascii="Segoe UI Symbol" w:hAnsi="Segoe UI Symbol"/>
                 <w:sz w:val="18"/>
               </w:rPr>
+              <w:t xml:space="preserve">☑ </w:t>
+            </w:r>
+            <w:r>
+              <w:rPr>
+                <w:rFonts w:ascii="Arial" w:hAnsi="Arial"/>
+                <w:sz w:val="18"/>
+              </w:rPr>
+              <w:t xml:space="preserve">Mark outside content as data, not instructions</w:t>
+            </w:r>
+          </w:p>
+          <w:p>
+            <w:pPr>
+              <w:spacing w:after="60"/>
+            </w:pPr>
+            <w:r>
+              <w:rPr>
+                <w:rFonts w:ascii="Segoe UI Symbol" w:hAnsi="Segoe UI Symbol"/>
+                <w:sz w:val="18"/>
+              </w:rPr>
+              <w:t xml:space="preserve">☑ </w:t>
+            </w:r>
+            <w:r>
+              <w:rPr>
+                <w:rFonts w:ascii="Arial" w:hAnsi="Arial"/>
+                <w:sz w:val="18"/>
+              </w:rPr>
+              <w:t xml:space="preserve">keep our own list of tools allowed to run without approval</w:t>
+            </w:r>
+          </w:p>
+          <w:p>
+            <w:pPr>
+              <w:spacing w:after="60"/>
+            </w:pPr>
+            <w:r>
+              <w:rPr>
+                <w:rFonts w:ascii="Segoe UI Symbol" w:hAnsi="Segoe UI Symbol"/>
+                <w:sz w:val="18"/>
+              </w:rPr>
               <w:t xml:space="preserve">☐ </w:t>
             </w:r>
             <w:r>
@@ -3162,45 +3367,7 @@
                 <w:rFonts w:ascii="Arial" w:hAnsi="Arial"/>
                 <w:sz w:val="18"/>
               </w:rPr>
-              <w:t>Mark outside content as data, not instructions</w:t>
-            </w:r>
-          </w:p>
-          <w:p>
-            <w:pPr>
-              <w:spacing w:after="60"/>
-            </w:pPr>
-            <w:r>
-              <w:rPr>
-                <w:rFonts w:ascii="Segoe UI Symbol" w:hAnsi="Segoe UI Symbol"/>
-                <w:sz w:val="18"/>
-              </w:rPr>
-              <w:t xml:space="preserve">☐ </w:t>
-            </w:r>
-            <w:r>
-              <w:rPr>
-                <w:rFonts w:ascii="Arial" w:hAnsi="Arial"/>
-                <w:sz w:val="18"/>
-              </w:rPr>
-              <w:t>keep our own list of tools allowed to run without approval</w:t>
-            </w:r>
-          </w:p>
-          <w:p>
-            <w:pPr>
-              <w:spacing w:after="60"/>
-            </w:pPr>
-            <w:r>
-              <w:rPr>
-                <w:rFonts w:ascii="Segoe UI Symbol" w:hAnsi="Segoe UI Symbol"/>
-                <w:sz w:val="18"/>
-              </w:rPr>
-              <w:t xml:space="preserve">☐ </w:t>
-            </w:r>
-            <w:r>
-              <w:rPr>
-                <w:rFonts w:ascii="Arial" w:hAnsi="Arial"/>
-                <w:sz w:val="18"/>
-              </w:rPr>
-              <w:t>prompt-injection test set run in CI.</w:t>
+              <w:t xml:space="preserve">prompt-injection test set run in CI.</w:t>
             </w:r>
           </w:p>
         </w:tc>
@@ -3367,7 +3534,7 @@
                 <w:rFonts w:ascii="Arial" w:hAnsi="Arial"/>
                 <w:sz w:val="18"/>
               </w:rPr>
-              <w:t>Show the full payload and diff (roadmap item 4)</w:t>
+              <w:t xml:space="preserve">Show the full payload and diff (roadmap item 4)</w:t>
             </w:r>
           </w:p>
           <w:p>
@@ -3386,7 +3553,7 @@
                 <w:rFonts w:ascii="Arial" w:hAnsi="Arial"/>
                 <w:sz w:val="18"/>
               </w:rPr>
-              <w:t>expire approvals after 24 hours</w:t>
+              <w:t xml:space="preserve">expire approvals after 24 hours</w:t>
             </w:r>
           </w:p>
           <w:p>
@@ -3405,7 +3572,7 @@
                 <w:rFonts w:ascii="Arial" w:hAnsi="Arial"/>
                 <w:sz w:val="18"/>
               </w:rPr>
-              <w:t>two-person rule for risky actions (roadmap item 3)</w:t>
+              <w:t xml:space="preserve">two-person rule for risky actions (roadmap item 3)</w:t>
             </w:r>
           </w:p>
           <w:p>
@@ -3424,7 +3591,7 @@
                 <w:rFonts w:ascii="Arial" w:hAnsi="Arial"/>
                 <w:sz w:val="18"/>
               </w:rPr>
-              <w:t>check the approver's own access for 'Run as me'.</w:t>
+              <w:t xml:space="preserve">check the approver's own access for 'Run as me'.</w:t>
             </w:r>
           </w:p>
         </w:tc>
@@ -3595,14 +3762,14 @@
                 <w:rFonts w:ascii="Segoe UI Symbol" w:hAnsi="Segoe UI Symbol"/>
                 <w:sz w:val="18"/>
               </w:rPr>
-              <w:t xml:space="preserve">☐ </w:t>
+              <w:t xml:space="preserve">☑ </w:t>
             </w:r>
             <w:r>
               <w:rPr>
                 <w:rFonts w:ascii="Arial" w:hAnsi="Arial"/>
                 <w:sz w:val="18"/>
               </w:rPr>
-              <w:t>Editing transfers ownership or needs the owner's re-approval</w:t>
+              <w:t xml:space="preserve">Editing transfers ownership or needs the owner's re-approval</w:t>
             </w:r>
           </w:p>
           <w:p>
@@ -3614,14 +3781,14 @@
                 <w:rFonts w:ascii="Segoe UI Symbol" w:hAnsi="Segoe UI Symbol"/>
                 <w:sz w:val="18"/>
               </w:rPr>
-              <w:t xml:space="preserve">☐ </w:t>
+              <w:t xml:space="preserve">☑ </w:t>
             </w:r>
             <w:r>
               <w:rPr>
                 <w:rFonts w:ascii="Arial" w:hAnsi="Arial"/>
                 <w:sz w:val="18"/>
               </w:rPr>
-              <w:t>only Admins take over</w:t>
+              <w:t xml:space="preserve">only Admins take over</w:t>
             </w:r>
           </w:p>
           <w:p>
@@ -3640,7 +3807,7 @@
                 <w:rFonts w:ascii="Arial" w:hAnsi="Arial"/>
                 <w:sz w:val="18"/>
               </w:rPr>
-              <w:t>enforce 'requires approval' on the server</w:t>
+              <w:t xml:space="preserve">enforce 'requires approval' on the server</w:t>
             </w:r>
           </w:p>
           <w:p>
@@ -3652,14 +3819,14 @@
                 <w:rFonts w:ascii="Segoe UI Symbol" w:hAnsi="Segoe UI Symbol"/>
                 <w:sz w:val="18"/>
               </w:rPr>
-              <w:t xml:space="preserve">☐ </w:t>
+              <w:t xml:space="preserve">☑ </w:t>
             </w:r>
             <w:r>
               <w:rPr>
                 <w:rFonts w:ascii="Arial" w:hAnsi="Arial"/>
                 <w:sz w:val="18"/>
               </w:rPr>
-              <w:t>per-workspace run quotas.</w:t>
+              <w:t xml:space="preserve">per-workspace run quotas.</w:t>
             </w:r>
           </w:p>
         </w:tc>
@@ -3818,6 +3985,25 @@
                 <w:rFonts w:ascii="Segoe UI Symbol" w:hAnsi="Segoe UI Symbol"/>
                 <w:sz w:val="18"/>
               </w:rPr>
+              <w:t xml:space="preserve">☑ </w:t>
+            </w:r>
+            <w:r>
+              <w:rPr>
+                <w:rFonts w:ascii="Arial" w:hAnsi="Arial"/>
+                <w:sz w:val="18"/>
+              </w:rPr>
+              <w:t xml:space="preserve">Always use the caller's own connection</w:t>
+            </w:r>
+          </w:p>
+          <w:p>
+            <w:pPr>
+              <w:spacing w:after="60"/>
+            </w:pPr>
+            <w:r>
+              <w:rPr>
+                <w:rFonts w:ascii="Segoe UI Symbol" w:hAnsi="Segoe UI Symbol"/>
+                <w:sz w:val="18"/>
+              </w:rPr>
               <w:t xml:space="preserve">☐ </w:t>
             </w:r>
             <w:r>
@@ -3825,7 +4011,7 @@
                 <w:rFonts w:ascii="Arial" w:hAnsi="Arial"/>
                 <w:sz w:val="18"/>
               </w:rPr>
-              <w:t>Always use the caller's own connection</w:t>
+              <w:t xml:space="preserve">send Slack sharing through approval</w:t>
             </w:r>
           </w:p>
           <w:p>
@@ -3837,6 +4023,44 @@
                 <w:rFonts w:ascii="Segoe UI Symbol" w:hAnsi="Segoe UI Symbol"/>
                 <w:sz w:val="18"/>
               </w:rPr>
+              <w:t xml:space="preserve">☑ </w:t>
+            </w:r>
+            <w:r>
+              <w:rPr>
+                <w:rFonts w:ascii="Arial" w:hAnsi="Arial"/>
+                <w:sz w:val="18"/>
+              </w:rPr>
+              <w:t xml:space="preserve">narrower scopes or a GitHub App</w:t>
+            </w:r>
+          </w:p>
+          <w:p>
+            <w:pPr>
+              <w:spacing w:after="60"/>
+            </w:pPr>
+            <w:r>
+              <w:rPr>
+                <w:rFonts w:ascii="Segoe UI Symbol" w:hAnsi="Segoe UI Symbol"/>
+                <w:sz w:val="18"/>
+              </w:rPr>
+              <w:t xml:space="preserve">☑ </w:t>
+            </w:r>
+            <w:r>
+              <w:rPr>
+                <w:rFonts w:ascii="Arial" w:hAnsi="Arial"/>
+                <w:sz w:val="18"/>
+              </w:rPr>
+              <w:t xml:space="preserve">versioned keys with a re-encrypt script</w:t>
+            </w:r>
+          </w:p>
+          <w:p>
+            <w:pPr>
+              <w:spacing w:after="60"/>
+            </w:pPr>
+            <w:r>
+              <w:rPr>
+                <w:rFonts w:ascii="Segoe UI Symbol" w:hAnsi="Segoe UI Symbol"/>
+                <w:sz w:val="18"/>
+              </w:rPr>
               <w:t xml:space="preserve">☐ </w:t>
             </w:r>
             <w:r>
@@ -3844,64 +4068,7 @@
                 <w:rFonts w:ascii="Arial" w:hAnsi="Arial"/>
                 <w:sz w:val="18"/>
               </w:rPr>
-              <w:t>send Slack sharing through approval</w:t>
-            </w:r>
-          </w:p>
-          <w:p>
-            <w:pPr>
-              <w:spacing w:after="60"/>
-            </w:pPr>
-            <w:r>
-              <w:rPr>
-                <w:rFonts w:ascii="Segoe UI Symbol" w:hAnsi="Segoe UI Symbol"/>
-                <w:sz w:val="18"/>
-              </w:rPr>
-              <w:t xml:space="preserve">☐ </w:t>
-            </w:r>
-            <w:r>
-              <w:rPr>
-                <w:rFonts w:ascii="Arial" w:hAnsi="Arial"/>
-                <w:sz w:val="18"/>
-              </w:rPr>
-              <w:t>narrower scopes or a GitHub App</w:t>
-            </w:r>
-          </w:p>
-          <w:p>
-            <w:pPr>
-              <w:spacing w:after="60"/>
-            </w:pPr>
-            <w:r>
-              <w:rPr>
-                <w:rFonts w:ascii="Segoe UI Symbol" w:hAnsi="Segoe UI Symbol"/>
-                <w:sz w:val="18"/>
-              </w:rPr>
-              <w:t xml:space="preserve">☐ </w:t>
-            </w:r>
-            <w:r>
-              <w:rPr>
-                <w:rFonts w:ascii="Arial" w:hAnsi="Arial"/>
-                <w:sz w:val="18"/>
-              </w:rPr>
-              <w:t>versioned keys with a re-encrypt script</w:t>
-            </w:r>
-          </w:p>
-          <w:p>
-            <w:pPr>
-              <w:spacing w:after="60"/>
-            </w:pPr>
-            <w:r>
-              <w:rPr>
-                <w:rFonts w:ascii="Segoe UI Symbol" w:hAnsi="Segoe UI Symbol"/>
-                <w:sz w:val="18"/>
-              </w:rPr>
-              <w:t xml:space="preserve">☐ </w:t>
-            </w:r>
-            <w:r>
-              <w:rPr>
-                <w:rFonts w:ascii="Arial" w:hAnsi="Arial"/>
-                <w:sz w:val="18"/>
-              </w:rPr>
-              <w:t>revoke tokens on disconnect.</w:t>
+              <w:t xml:space="preserve">revoke tokens on disconnect.</w:t>
             </w:r>
           </w:p>
         </w:tc>
@@ -4056,14 +4223,14 @@
                 <w:rFonts w:ascii="Segoe UI Symbol" w:hAnsi="Segoe UI Symbol"/>
                 <w:sz w:val="18"/>
               </w:rPr>
-              <w:t xml:space="preserve">☐ </w:t>
+              <w:t xml:space="preserve">☑ </w:t>
             </w:r>
             <w:r>
               <w:rPr>
                 <w:rFonts w:ascii="Arial" w:hAnsi="Arial"/>
                 <w:sz w:val="18"/>
               </w:rPr>
-              <w:t>Treat event text as untrusted</w:t>
+              <w:t xml:space="preserve">Treat event text as untrusted</w:t>
             </w:r>
           </w:p>
           <w:p>
@@ -4075,14 +4242,14 @@
                 <w:rFonts w:ascii="Segoe UI Symbol" w:hAnsi="Segoe UI Symbol"/>
                 <w:sz w:val="18"/>
               </w:rPr>
-              <w:t xml:space="preserve">☐ </w:t>
+              <w:t xml:space="preserve">☑ </w:t>
             </w:r>
             <w:r>
               <w:rPr>
                 <w:rFonts w:ascii="Arial" w:hAnsi="Arial"/>
                 <w:sz w:val="18"/>
               </w:rPr>
-              <w:t>cap its size and the number of runs each repository can trigger.</w:t>
+              <w:t xml:space="preserve">cap its size and the number of runs each repository can trigger.</w:t>
             </w:r>
           </w:p>
         </w:tc>
@@ -4241,14 +4408,14 @@
                 <w:rFonts w:ascii="Segoe UI Symbol" w:hAnsi="Segoe UI Symbol"/>
                 <w:sz w:val="18"/>
               </w:rPr>
-              <w:t xml:space="preserve">☐ </w:t>
+              <w:t xml:space="preserve">☑ </w:t>
             </w:r>
             <w:r>
               <w:rPr>
                 <w:rFonts w:ascii="Arial" w:hAnsi="Arial"/>
                 <w:sz w:val="18"/>
               </w:rPr>
-              <w:t>Add no-cache/no-index headers</w:t>
+              <w:t xml:space="preserve">Add no-cache/no-index headers</w:t>
             </w:r>
           </w:p>
           <w:p>
@@ -4260,14 +4427,14 @@
                 <w:rFonts w:ascii="Segoe UI Symbol" w:hAnsi="Segoe UI Symbol"/>
                 <w:sz w:val="18"/>
               </w:rPr>
-              <w:t xml:space="preserve">☐ </w:t>
+              <w:t xml:space="preserve">☑ </w:t>
             </w:r>
             <w:r>
               <w:rPr>
                 <w:rFonts w:ascii="Arial" w:hAnsi="Arial"/>
                 <w:sz w:val="18"/>
               </w:rPr>
-              <w:t>optional link expiry</w:t>
+              <w:t xml:space="preserve">optional link expiry</w:t>
             </w:r>
           </w:p>
           <w:p>
@@ -4279,14 +4446,14 @@
                 <w:rFonts w:ascii="Segoe UI Symbol" w:hAnsi="Segoe UI Symbol"/>
                 <w:sz w:val="18"/>
               </w:rPr>
-              <w:t xml:space="preserve">☐ </w:t>
+              <w:t xml:space="preserve">☑ </w:t>
             </w:r>
             <w:r>
               <w:rPr>
                 <w:rFonts w:ascii="Arial" w:hAnsi="Arial"/>
                 <w:sz w:val="18"/>
               </w:rPr>
-              <w:t>review every field a public view returns</w:t>
+              <w:t xml:space="preserve">review every field a public view returns</w:t>
             </w:r>
           </w:p>
           <w:p>
@@ -4298,14 +4465,14 @@
                 <w:rFonts w:ascii="Segoe UI Symbol" w:hAnsi="Segoe UI Symbol"/>
                 <w:sz w:val="18"/>
               </w:rPr>
-              <w:t xml:space="preserve">☐ </w:t>
+              <w:t xml:space="preserve">☑ </w:t>
             </w:r>
             <w:r>
               <w:rPr>
                 <w:rFonts w:ascii="Arial" w:hAnsi="Arial"/>
                 <w:sz w:val="18"/>
               </w:rPr>
-              <w:t>view counter.</w:t>
+              <w:t xml:space="preserve">view counter.</w:t>
             </w:r>
           </w:p>
         </w:tc>
@@ -4467,7 +4634,7 @@
                 <w:rFonts w:ascii="Arial" w:hAnsi="Arial"/>
                 <w:sz w:val="18"/>
               </w:rPr>
-              <w:t>Admin review for memory changes</w:t>
+              <w:t xml:space="preserve">Admin review for memory changes</w:t>
             </w:r>
           </w:p>
           <w:p>
@@ -4486,7 +4653,7 @@
                 <w:rFonts w:ascii="Arial" w:hAnsi="Arial"/>
                 <w:sz w:val="18"/>
               </w:rPr>
-              <w:t>log task changes</w:t>
+              <w:t xml:space="preserve">log task changes</w:t>
             </w:r>
           </w:p>
           <w:p>
@@ -4505,7 +4672,7 @@
                 <w:rFonts w:ascii="Arial" w:hAnsi="Arial"/>
                 <w:sz w:val="18"/>
               </w:rPr>
-              <w:t>neutralise formulas in the CSV export.</w:t>
+              <w:t xml:space="preserve">neutralise formulas in the CSV export.</w:t>
             </w:r>
           </w:p>
         </w:tc>
@@ -4703,7 +4870,7 @@
                 <w:rFonts w:ascii="Arial" w:hAnsi="Arial"/>
                 <w:sz w:val="18"/>
               </w:rPr>
-              <w:t>Add the headers in Caddy and Next.js</w:t>
+              <w:t xml:space="preserve">Add the headers in Caddy and Next.js</w:t>
             </w:r>
           </w:p>
           <w:p>
@@ -4722,7 +4889,7 @@
                 <w:rFonts w:ascii="Arial" w:hAnsi="Arial"/>
                 <w:sz w:val="18"/>
               </w:rPr>
-              <w:t>run an OWASP ZAP baseline scan on staging.</w:t>
+              <w:t xml:space="preserve">run an OWASP ZAP baseline scan on staging.</w:t>
             </w:r>
           </w:p>
         </w:tc>
@@ -4948,7 +5115,7 @@
                 <w:rFonts w:ascii="Arial" w:hAnsi="Arial"/>
                 <w:sz w:val="18"/>
               </w:rPr>
-              <w:t>npm audit fix</w:t>
+              <w:t xml:space="preserve">npm audit fix</w:t>
             </w:r>
           </w:p>
           <w:p>
@@ -4967,7 +5134,7 @@
                 <w:rFonts w:ascii="Arial" w:hAnsi="Arial"/>
                 <w:sz w:val="18"/>
               </w:rPr>
-              <w:t>pin the image version</w:t>
+              <w:t xml:space="preserve">pin the image version</w:t>
             </w:r>
           </w:p>
           <w:p>
@@ -4986,7 +5153,7 @@
                 <w:rFonts w:ascii="Arial" w:hAnsi="Arial"/>
                 <w:sz w:val="18"/>
               </w:rPr>
-              <w:t>run as a non-root user</w:t>
+              <w:t xml:space="preserve">run as a non-root user</w:t>
             </w:r>
           </w:p>
           <w:p>
@@ -5005,7 +5172,7 @@
                 <w:rFonts w:ascii="Arial" w:hAnsi="Arial"/>
                 <w:sz w:val="18"/>
               </w:rPr>
-              <w:t>add dependency, code (CodeQL), secret and image scans to CI.</w:t>
+              <w:t xml:space="preserve">add dependency, code (CodeQL), secret and image scans to CI.</w:t>
             </w:r>
           </w:p>
         </w:tc>
@@ -5171,7 +5338,7 @@
                 <w:rFonts w:ascii="Arial" w:hAnsi="Arial"/>
                 <w:sz w:val="18"/>
               </w:rPr>
-              <w:t>Rate limits on each</w:t>
+              <w:t xml:space="preserve">Rate limits on each</w:t>
             </w:r>
           </w:p>
           <w:p>
@@ -5190,7 +5357,7 @@
                 <w:rFonts w:ascii="Arial" w:hAnsi="Arial"/>
                 <w:sz w:val="18"/>
               </w:rPr>
-              <w:t>a daily token budget per workspace, shown in Observability.</w:t>
+              <w:t xml:space="preserve">a daily token budget per workspace, shown in Observability.</w:t>
             </w:r>
           </w:p>
         </w:tc>
@@ -5529,7 +5696,7 @@
                 <w:sz w:val="16"/>
                 <w:szCs w:val="16"/>
               </w:rPr>
-              <w:t xml:space="preserve">Next steps</w:t>
+              <w:t>Next steps checklist</w:t>
             </w:r>
           </w:p>
         </w:tc>
@@ -5677,14 +5844,74 @@
           </w:tcPr>
           <w:p>
             <w:pPr>
-              <w:spacing w:after="0" w:line="228" w:lineRule="auto"/>
-            </w:pPr>
-            <w:r>
-              <w:rPr>
-                <w:sz w:val="16"/>
-                <w:szCs w:val="16"/>
-              </w:rPr>
-              <w:t xml:space="preserve">Run each process under a supervisor (or split into separate services) with restart on failure; point the container health check at /readyz; drain connections and finish agent turns on shutdown; rolling or blue-green deploys.</w:t>
+              <w:spacing w:after="60"/>
+            </w:pPr>
+            <w:r>
+              <w:rPr>
+                <w:rFonts w:ascii="Segoe UI Symbol" w:hAnsi="Segoe UI Symbol"/>
+                <w:sz w:val="16"/>
+              </w:rPr>
+              <w:t xml:space="preserve">☐ </w:t>
+            </w:r>
+            <w:r>
+              <w:rPr>
+                <w:sz w:val="16"/>
+              </w:rPr>
+              <w:t xml:space="preserve">Run each process under a supervisor (or split into separate services) with restart on failure</w:t>
+            </w:r>
+          </w:p>
+          <w:p>
+            <w:pPr>
+              <w:spacing w:after="60"/>
+            </w:pPr>
+            <w:r>
+              <w:rPr>
+                <w:rFonts w:ascii="Segoe UI Symbol" w:hAnsi="Segoe UI Symbol"/>
+                <w:sz w:val="16"/>
+              </w:rPr>
+              <w:t xml:space="preserve">☐ </w:t>
+            </w:r>
+            <w:r>
+              <w:rPr>
+                <w:sz w:val="16"/>
+              </w:rPr>
+              <w:t xml:space="preserve">Point the container health check at /readyz</w:t>
+            </w:r>
+          </w:p>
+          <w:p>
+            <w:pPr>
+              <w:spacing w:after="60"/>
+            </w:pPr>
+            <w:r>
+              <w:rPr>
+                <w:rFonts w:ascii="Segoe UI Symbol" w:hAnsi="Segoe UI Symbol"/>
+                <w:sz w:val="16"/>
+              </w:rPr>
+              <w:t xml:space="preserve">☐ </w:t>
+            </w:r>
+            <w:r>
+              <w:rPr>
+                <w:sz w:val="16"/>
+              </w:rPr>
+              <w:t xml:space="preserve">Drain connections and finish agent turns on shutdown</w:t>
+            </w:r>
+          </w:p>
+          <w:p>
+            <w:pPr>
+              <w:spacing w:after="60"/>
+            </w:pPr>
+            <w:r>
+              <w:rPr>
+                <w:rFonts w:ascii="Segoe UI Symbol" w:hAnsi="Segoe UI Symbol"/>
+                <w:sz w:val="16"/>
+              </w:rPr>
+              <w:t xml:space="preserve">☐ </w:t>
+            </w:r>
+            <w:r>
+              <w:rPr>
+                <w:sz w:val="16"/>
+              </w:rPr>
+              <w:t xml:space="preserve">Rolling or blue-green deploys</w:t>
             </w:r>
           </w:p>
         </w:tc>
@@ -5836,14 +6063,56 @@
           </w:tcPr>
           <w:p>
             <w:pPr>
-              <w:spacing w:after="0" w:line="228" w:lineRule="auto"/>
-            </w:pPr>
-            <w:r>
-              <w:rPr>
-                <w:sz w:val="16"/>
-                <w:szCs w:val="16"/>
-              </w:rPr>
-              <w:t xml:space="preserve">Load-test with two or more instances behind a load balancer with sticky WebSockets; refresh the lock while a turn runs and shorten its expiry; lower the model timeout to about 2 minutes.</w:t>
+              <w:spacing w:after="60"/>
+            </w:pPr>
+            <w:r>
+              <w:rPr>
+                <w:rFonts w:ascii="Segoe UI Symbol" w:hAnsi="Segoe UI Symbol"/>
+                <w:sz w:val="16"/>
+              </w:rPr>
+              <w:t xml:space="preserve">☐ </w:t>
+            </w:r>
+            <w:r>
+              <w:rPr>
+                <w:sz w:val="16"/>
+              </w:rPr>
+              <w:t xml:space="preserve">Load-test with two or more instances behind a load balancer with sticky WebSockets</w:t>
+            </w:r>
+          </w:p>
+          <w:p>
+            <w:pPr>
+              <w:spacing w:after="60"/>
+            </w:pPr>
+            <w:r>
+              <w:rPr>
+                <w:rFonts w:ascii="Segoe UI Symbol" w:hAnsi="Segoe UI Symbol"/>
+                <w:sz w:val="16"/>
+              </w:rPr>
+              <w:t xml:space="preserve">☐ </w:t>
+            </w:r>
+            <w:r>
+              <w:rPr>
+                <w:sz w:val="16"/>
+              </w:rPr>
+              <w:t xml:space="preserve">Refresh the lock while a turn runs and shorten its expiry</w:t>
+            </w:r>
+          </w:p>
+          <w:p>
+            <w:pPr>
+              <w:spacing w:after="60"/>
+            </w:pPr>
+            <w:r>
+              <w:rPr>
+                <w:rFonts w:ascii="Segoe UI Symbol" w:hAnsi="Segoe UI Symbol"/>
+                <w:sz w:val="16"/>
+              </w:rPr>
+              <w:t xml:space="preserve">☐ </w:t>
+            </w:r>
+            <w:r>
+              <w:rPr>
+                <w:sz w:val="16"/>
+              </w:rPr>
+              <w:t xml:space="preserve">Lower the model timeout to about 2 minutes</w:t>
             </w:r>
           </w:p>
         </w:tc>
@@ -5991,14 +6260,56 @@
           </w:tcPr>
           <w:p>
             <w:pPr>
-              <w:spacing w:after="0" w:line="228" w:lineRule="auto"/>
-            </w:pPr>
-            <w:r>
-              <w:rPr>
-                <w:sz w:val="16"/>
-                <w:szCs w:val="16"/>
-              </w:rPr>
-              <w:t xml:space="preserve">Batch presence updates and skip rooms with no remote listeners; reconnect the listener automatically with alerting; move fan-out to Redis pub/sub once there are more than a few hundred concurrent users.</w:t>
+              <w:spacing w:after="60"/>
+            </w:pPr>
+            <w:r>
+              <w:rPr>
+                <w:rFonts w:ascii="Segoe UI Symbol" w:hAnsi="Segoe UI Symbol"/>
+                <w:sz w:val="16"/>
+              </w:rPr>
+              <w:t xml:space="preserve">☐ </w:t>
+            </w:r>
+            <w:r>
+              <w:rPr>
+                <w:sz w:val="16"/>
+              </w:rPr>
+              <w:t xml:space="preserve">Batch presence updates and skip rooms with no remote listeners</w:t>
+            </w:r>
+          </w:p>
+          <w:p>
+            <w:pPr>
+              <w:spacing w:after="60"/>
+            </w:pPr>
+            <w:r>
+              <w:rPr>
+                <w:rFonts w:ascii="Segoe UI Symbol" w:hAnsi="Segoe UI Symbol"/>
+                <w:sz w:val="16"/>
+              </w:rPr>
+              <w:t xml:space="preserve">☐ </w:t>
+            </w:r>
+            <w:r>
+              <w:rPr>
+                <w:sz w:val="16"/>
+              </w:rPr>
+              <w:t xml:space="preserve">Reconnect the listener automatically with alerting</w:t>
+            </w:r>
+          </w:p>
+          <w:p>
+            <w:pPr>
+              <w:spacing w:after="60"/>
+            </w:pPr>
+            <w:r>
+              <w:rPr>
+                <w:rFonts w:ascii="Segoe UI Symbol" w:hAnsi="Segoe UI Symbol"/>
+                <w:sz w:val="16"/>
+              </w:rPr>
+              <w:t xml:space="preserve">☐ </w:t>
+            </w:r>
+            <w:r>
+              <w:rPr>
+                <w:sz w:val="16"/>
+              </w:rPr>
+              <w:t xml:space="preserve">Move fan-out to Redis pub/sub once there are more than a few hundred concurrent users</w:t>
             </w:r>
           </w:p>
         </w:tc>
@@ -6150,14 +6461,74 @@
           </w:tcPr>
           <w:p>
             <w:pPr>
-              <w:spacing w:after="0" w:line="228" w:lineRule="auto"/>
-            </w:pPr>
-            <w:r>
-              <w:rPr>
-                <w:sz w:val="16"/>
-                <w:szCs w:val="16"/>
-              </w:rPr>
-              <w:t xml:space="preserve">Load the newest 200 (order descending, then reverse) and add an index on (conversation, created_at); size the pool and set statement and idle timeouts; add a trigram index for activity search; review slow queries with pg_stat_statements.</w:t>
+              <w:spacing w:after="60"/>
+            </w:pPr>
+            <w:r>
+              <w:rPr>
+                <w:rFonts w:ascii="Segoe UI Symbol" w:hAnsi="Segoe UI Symbol"/>
+                <w:sz w:val="16"/>
+              </w:rPr>
+              <w:t xml:space="preserve">☐ </w:t>
+            </w:r>
+            <w:r>
+              <w:rPr>
+                <w:sz w:val="16"/>
+              </w:rPr>
+              <w:t xml:space="preserve">Load the newest 200 (order descending, then reverse) and add an index on (conversation, created_at)</w:t>
+            </w:r>
+          </w:p>
+          <w:p>
+            <w:pPr>
+              <w:spacing w:after="60"/>
+            </w:pPr>
+            <w:r>
+              <w:rPr>
+                <w:rFonts w:ascii="Segoe UI Symbol" w:hAnsi="Segoe UI Symbol"/>
+                <w:sz w:val="16"/>
+              </w:rPr>
+              <w:t xml:space="preserve">☐ </w:t>
+            </w:r>
+            <w:r>
+              <w:rPr>
+                <w:sz w:val="16"/>
+              </w:rPr>
+              <w:t xml:space="preserve">Size the pool and set statement and idle timeouts</w:t>
+            </w:r>
+          </w:p>
+          <w:p>
+            <w:pPr>
+              <w:spacing w:after="60"/>
+            </w:pPr>
+            <w:r>
+              <w:rPr>
+                <w:rFonts w:ascii="Segoe UI Symbol" w:hAnsi="Segoe UI Symbol"/>
+                <w:sz w:val="16"/>
+              </w:rPr>
+              <w:t xml:space="preserve">☐ </w:t>
+            </w:r>
+            <w:r>
+              <w:rPr>
+                <w:sz w:val="16"/>
+              </w:rPr>
+              <w:t xml:space="preserve">Add a trigram index for activity search</w:t>
+            </w:r>
+          </w:p>
+          <w:p>
+            <w:pPr>
+              <w:spacing w:after="60"/>
+            </w:pPr>
+            <w:r>
+              <w:rPr>
+                <w:rFonts w:ascii="Segoe UI Symbol" w:hAnsi="Segoe UI Symbol"/>
+                <w:sz w:val="16"/>
+              </w:rPr>
+              <w:t xml:space="preserve">☐ </w:t>
+            </w:r>
+            <w:r>
+              <w:rPr>
+                <w:sz w:val="16"/>
+              </w:rPr>
+              <w:t xml:space="preserve">Review slow queries with pg_stat_statements</w:t>
             </w:r>
           </w:p>
         </w:tc>
@@ -6305,14 +6676,74 @@
           </w:tcPr>
           <w:p>
             <w:pPr>
-              <w:spacing w:after="0" w:line="228" w:lineRule="auto"/>
-            </w:pPr>
-            <w:r>
-              <w:rPr>
-                <w:sz w:val="16"/>
-                <w:szCs w:val="16"/>
-              </w:rPr>
-              <w:t xml:space="preserve">Nightly automated dumps to object storage with 30-day retention, plus WAL archiving for point-in-time recovery (or a managed Postgres); quarterly restore drill; remove or guard the reset-on-start switch.</w:t>
+              <w:spacing w:after="60"/>
+            </w:pPr>
+            <w:r>
+              <w:rPr>
+                <w:rFonts w:ascii="Segoe UI Symbol" w:hAnsi="Segoe UI Symbol"/>
+                <w:sz w:val="16"/>
+              </w:rPr>
+              <w:t xml:space="preserve">☐ </w:t>
+            </w:r>
+            <w:r>
+              <w:rPr>
+                <w:sz w:val="16"/>
+              </w:rPr>
+              <w:t xml:space="preserve">Nightly automated dumps to object storage with 30-day retention</w:t>
+            </w:r>
+          </w:p>
+          <w:p>
+            <w:pPr>
+              <w:spacing w:after="60"/>
+            </w:pPr>
+            <w:r>
+              <w:rPr>
+                <w:rFonts w:ascii="Segoe UI Symbol" w:hAnsi="Segoe UI Symbol"/>
+                <w:sz w:val="16"/>
+              </w:rPr>
+              <w:t xml:space="preserve">☐ </w:t>
+            </w:r>
+            <w:r>
+              <w:rPr>
+                <w:sz w:val="16"/>
+              </w:rPr>
+              <w:t xml:space="preserve">WAL archiving for point-in-time recovery (or a managed Postgres)</w:t>
+            </w:r>
+          </w:p>
+          <w:p>
+            <w:pPr>
+              <w:spacing w:after="60"/>
+            </w:pPr>
+            <w:r>
+              <w:rPr>
+                <w:rFonts w:ascii="Segoe UI Symbol" w:hAnsi="Segoe UI Symbol"/>
+                <w:sz w:val="16"/>
+              </w:rPr>
+              <w:t xml:space="preserve">☐ </w:t>
+            </w:r>
+            <w:r>
+              <w:rPr>
+                <w:sz w:val="16"/>
+              </w:rPr>
+              <w:t xml:space="preserve">Quarterly restore drill</w:t>
+            </w:r>
+          </w:p>
+          <w:p>
+            <w:pPr>
+              <w:spacing w:after="60"/>
+            </w:pPr>
+            <w:r>
+              <w:rPr>
+                <w:rFonts w:ascii="Segoe UI Symbol" w:hAnsi="Segoe UI Symbol"/>
+                <w:sz w:val="16"/>
+              </w:rPr>
+              <w:t xml:space="preserve">☐ </w:t>
+            </w:r>
+            <w:r>
+              <w:rPr>
+                <w:sz w:val="16"/>
+              </w:rPr>
+              <w:t xml:space="preserve">Remove or guard the reset-on-start switch</w:t>
             </w:r>
           </w:p>
         </w:tc>
@@ -6464,14 +6895,56 @@
           </w:tcPr>
           <w:p>
             <w:pPr>
-              <w:spacing w:after="0" w:line="228" w:lineRule="auto"/>
-            </w:pPr>
-            <w:r>
-              <w:rPr>
-                <w:sz w:val="16"/>
-                <w:szCs w:val="16"/>
-              </w:rPr>
-              <w:t xml:space="preserve">Durable job queue with retries, concurrency limits and idempotency keys (roadmap item 6); sweep stale 'running' runs on start; separate worker process so heavy runs never slow chat.</w:t>
+              <w:spacing w:after="60"/>
+            </w:pPr>
+            <w:r>
+              <w:rPr>
+                <w:rFonts w:ascii="Segoe UI Symbol" w:hAnsi="Segoe UI Symbol"/>
+                <w:sz w:val="16"/>
+              </w:rPr>
+              <w:t xml:space="preserve">☐ </w:t>
+            </w:r>
+            <w:r>
+              <w:rPr>
+                <w:sz w:val="16"/>
+              </w:rPr>
+              <w:t xml:space="preserve">Durable job queue with retries, concurrency limits and idempotency keys (roadmap item 6)</w:t>
+            </w:r>
+          </w:p>
+          <w:p>
+            <w:pPr>
+              <w:spacing w:after="60"/>
+            </w:pPr>
+            <w:r>
+              <w:rPr>
+                <w:rFonts w:ascii="Segoe UI Symbol" w:hAnsi="Segoe UI Symbol"/>
+                <w:sz w:val="16"/>
+              </w:rPr>
+              <w:t xml:space="preserve">☐ </w:t>
+            </w:r>
+            <w:r>
+              <w:rPr>
+                <w:sz w:val="16"/>
+              </w:rPr>
+              <w:t xml:space="preserve">Sweep stale 'running' runs on start</w:t>
+            </w:r>
+          </w:p>
+          <w:p>
+            <w:pPr>
+              <w:spacing w:after="60"/>
+            </w:pPr>
+            <w:r>
+              <w:rPr>
+                <w:rFonts w:ascii="Segoe UI Symbol" w:hAnsi="Segoe UI Symbol"/>
+                <w:sz w:val="16"/>
+              </w:rPr>
+              <w:t xml:space="preserve">☐ </w:t>
+            </w:r>
+            <w:r>
+              <w:rPr>
+                <w:sz w:val="16"/>
+              </w:rPr>
+              <w:t xml:space="preserve">Separate worker process so heavy runs never slow chat</w:t>
             </w:r>
           </w:p>
         </w:tc>
@@ -6619,14 +7092,92 @@
           </w:tcPr>
           <w:p>
             <w:pPr>
-              <w:spacing w:after="0" w:line="228" w:lineRule="auto"/>
-            </w:pPr>
-            <w:r>
-              <w:rPr>
-                <w:sz w:val="16"/>
-                <w:szCs w:val="16"/>
-              </w:rPr>
-              <w:t xml:space="preserve">Paid or higher-limit model tier; queue turns with position shown in chat; stream replies token by token; cache token counts per message; per-workspace concurrency and token budgets (roadmap item 7).</w:t>
+              <w:spacing w:after="60"/>
+            </w:pPr>
+            <w:r>
+              <w:rPr>
+                <w:rFonts w:ascii="Segoe UI Symbol" w:hAnsi="Segoe UI Symbol"/>
+                <w:sz w:val="16"/>
+              </w:rPr>
+              <w:t xml:space="preserve">☐ </w:t>
+            </w:r>
+            <w:r>
+              <w:rPr>
+                <w:sz w:val="16"/>
+              </w:rPr>
+              <w:t xml:space="preserve">Paid or higher-limit model tier</w:t>
+            </w:r>
+          </w:p>
+          <w:p>
+            <w:pPr>
+              <w:spacing w:after="60"/>
+            </w:pPr>
+            <w:r>
+              <w:rPr>
+                <w:rFonts w:ascii="Segoe UI Symbol" w:hAnsi="Segoe UI Symbol"/>
+                <w:sz w:val="16"/>
+              </w:rPr>
+              <w:t xml:space="preserve">☐ </w:t>
+            </w:r>
+            <w:r>
+              <w:rPr>
+                <w:sz w:val="16"/>
+              </w:rPr>
+              <w:t xml:space="preserve">Queue turns with position shown in chat</w:t>
+            </w:r>
+          </w:p>
+          <w:p>
+            <w:pPr>
+              <w:spacing w:after="60"/>
+            </w:pPr>
+            <w:r>
+              <w:rPr>
+                <w:rFonts w:ascii="Segoe UI Symbol" w:hAnsi="Segoe UI Symbol"/>
+                <w:sz w:val="16"/>
+              </w:rPr>
+              <w:t xml:space="preserve">☐ </w:t>
+            </w:r>
+            <w:r>
+              <w:rPr>
+                <w:sz w:val="16"/>
+              </w:rPr>
+              <w:t xml:space="preserve">Stream replies token by token</w:t>
+            </w:r>
+          </w:p>
+          <w:p>
+            <w:pPr>
+              <w:spacing w:after="60"/>
+            </w:pPr>
+            <w:r>
+              <w:rPr>
+                <w:rFonts w:ascii="Segoe UI Symbol" w:hAnsi="Segoe UI Symbol"/>
+                <w:sz w:val="16"/>
+              </w:rPr>
+              <w:t xml:space="preserve">☐ </w:t>
+            </w:r>
+            <w:r>
+              <w:rPr>
+                <w:sz w:val="16"/>
+              </w:rPr>
+              <w:t xml:space="preserve">Cache token counts per message</w:t>
+            </w:r>
+          </w:p>
+          <w:p>
+            <w:pPr>
+              <w:spacing w:after="60"/>
+            </w:pPr>
+            <w:r>
+              <w:rPr>
+                <w:rFonts w:ascii="Segoe UI Symbol" w:hAnsi="Segoe UI Symbol"/>
+                <w:sz w:val="16"/>
+              </w:rPr>
+              <w:t xml:space="preserve">☐ </w:t>
+            </w:r>
+            <w:r>
+              <w:rPr>
+                <w:sz w:val="16"/>
+              </w:rPr>
+              <w:t xml:space="preserve">Per-workspace concurrency and token budgets (roadmap item 7)</w:t>
             </w:r>
           </w:p>
         </w:tc>
@@ -6778,14 +7329,74 @@
           </w:tcPr>
           <w:p>
             <w:pPr>
-              <w:spacing w:after="0" w:line="228" w:lineRule="auto"/>
-            </w:pPr>
-            <w:r>
-              <w:rPr>
-                <w:sz w:val="16"/>
-                <w:szCs w:val="16"/>
-              </w:rPr>
-              <w:t xml:space="preserve">Cap total tool-process memory and track it; cache tool lists per connection; 30-second timeout per tool call; consider GitHub's hosted MCP endpoint instead of local processes.</w:t>
+              <w:spacing w:after="60"/>
+            </w:pPr>
+            <w:r>
+              <w:rPr>
+                <w:rFonts w:ascii="Segoe UI Symbol" w:hAnsi="Segoe UI Symbol"/>
+                <w:sz w:val="16"/>
+              </w:rPr>
+              <w:t xml:space="preserve">☐ </w:t>
+            </w:r>
+            <w:r>
+              <w:rPr>
+                <w:sz w:val="16"/>
+              </w:rPr>
+              <w:t xml:space="preserve">Cap total tool-process memory and track it</w:t>
+            </w:r>
+          </w:p>
+          <w:p>
+            <w:pPr>
+              <w:spacing w:after="60"/>
+            </w:pPr>
+            <w:r>
+              <w:rPr>
+                <w:rFonts w:ascii="Segoe UI Symbol" w:hAnsi="Segoe UI Symbol"/>
+                <w:sz w:val="16"/>
+              </w:rPr>
+              <w:t xml:space="preserve">☐ </w:t>
+            </w:r>
+            <w:r>
+              <w:rPr>
+                <w:sz w:val="16"/>
+              </w:rPr>
+              <w:t xml:space="preserve">Cache tool lists per connection</w:t>
+            </w:r>
+          </w:p>
+          <w:p>
+            <w:pPr>
+              <w:spacing w:after="60"/>
+            </w:pPr>
+            <w:r>
+              <w:rPr>
+                <w:rFonts w:ascii="Segoe UI Symbol" w:hAnsi="Segoe UI Symbol"/>
+                <w:sz w:val="16"/>
+              </w:rPr>
+              <w:t xml:space="preserve">☐ </w:t>
+            </w:r>
+            <w:r>
+              <w:rPr>
+                <w:sz w:val="16"/>
+              </w:rPr>
+              <w:t xml:space="preserve">30-second timeout per tool call</w:t>
+            </w:r>
+          </w:p>
+          <w:p>
+            <w:pPr>
+              <w:spacing w:after="60"/>
+            </w:pPr>
+            <w:r>
+              <w:rPr>
+                <w:rFonts w:ascii="Segoe UI Symbol" w:hAnsi="Segoe UI Symbol"/>
+                <w:sz w:val="16"/>
+              </w:rPr>
+              <w:t xml:space="preserve">☐ </w:t>
+            </w:r>
+            <w:r>
+              <w:rPr>
+                <w:sz w:val="16"/>
+              </w:rPr>
+              <w:t xml:space="preserve">Consider GitHub's hosted MCP endpoint instead of local processes</w:t>
             </w:r>
           </w:p>
         </w:tc>
@@ -6933,14 +7544,56 @@
           </w:tcPr>
           <w:p>
             <w:pPr>
-              <w:spacing w:after="0" w:line="228" w:lineRule="auto"/>
-            </w:pPr>
-            <w:r>
-              <w:rPr>
-                <w:sz w:val="16"/>
-                <w:szCs w:val="16"/>
-              </w:rPr>
-              <w:t xml:space="preserve">Retention settings and a nightly cleanup job for each table; archive old activity to cold storage; table-size dashboard.</w:t>
+              <w:spacing w:after="60"/>
+            </w:pPr>
+            <w:r>
+              <w:rPr>
+                <w:rFonts w:ascii="Segoe UI Symbol" w:hAnsi="Segoe UI Symbol"/>
+                <w:sz w:val="16"/>
+              </w:rPr>
+              <w:t xml:space="preserve">☐ </w:t>
+            </w:r>
+            <w:r>
+              <w:rPr>
+                <w:sz w:val="16"/>
+              </w:rPr>
+              <w:t xml:space="preserve">Retention settings and a nightly cleanup job for each table</w:t>
+            </w:r>
+          </w:p>
+          <w:p>
+            <w:pPr>
+              <w:spacing w:after="60"/>
+            </w:pPr>
+            <w:r>
+              <w:rPr>
+                <w:rFonts w:ascii="Segoe UI Symbol" w:hAnsi="Segoe UI Symbol"/>
+                <w:sz w:val="16"/>
+              </w:rPr>
+              <w:t xml:space="preserve">☐ </w:t>
+            </w:r>
+            <w:r>
+              <w:rPr>
+                <w:sz w:val="16"/>
+              </w:rPr>
+              <w:t xml:space="preserve">Archive old activity to cold storage</w:t>
+            </w:r>
+          </w:p>
+          <w:p>
+            <w:pPr>
+              <w:spacing w:after="60"/>
+            </w:pPr>
+            <w:r>
+              <w:rPr>
+                <w:rFonts w:ascii="Segoe UI Symbol" w:hAnsi="Segoe UI Symbol"/>
+                <w:sz w:val="16"/>
+              </w:rPr>
+              <w:t xml:space="preserve">☐ </w:t>
+            </w:r>
+            <w:r>
+              <w:rPr>
+                <w:sz w:val="16"/>
+              </w:rPr>
+              <w:t xml:space="preserve">Table-size dashboard</w:t>
             </w:r>
           </w:p>
         </w:tc>
@@ -7092,14 +7745,56 @@
           </w:tcPr>
           <w:p>
             <w:pPr>
-              <w:spacing w:after="0" w:line="228" w:lineRule="auto"/>
-            </w:pPr>
-            <w:r>
-              <w:rPr>
-                <w:sz w:val="16"/>
-                <w:szCs w:val="16"/>
-              </w:rPr>
-              <w:t xml:space="preserve">Push these updates over the existing WebSocket; slow polling when the tab is hidden; make the notifications read path read-only.</w:t>
+              <w:spacing w:after="60"/>
+            </w:pPr>
+            <w:r>
+              <w:rPr>
+                <w:rFonts w:ascii="Segoe UI Symbol" w:hAnsi="Segoe UI Symbol"/>
+                <w:sz w:val="16"/>
+              </w:rPr>
+              <w:t xml:space="preserve">☐ </w:t>
+            </w:r>
+            <w:r>
+              <w:rPr>
+                <w:sz w:val="16"/>
+              </w:rPr>
+              <w:t xml:space="preserve">Push these updates over the existing WebSocket</w:t>
+            </w:r>
+          </w:p>
+          <w:p>
+            <w:pPr>
+              <w:spacing w:after="60"/>
+            </w:pPr>
+            <w:r>
+              <w:rPr>
+                <w:rFonts w:ascii="Segoe UI Symbol" w:hAnsi="Segoe UI Symbol"/>
+                <w:sz w:val="16"/>
+              </w:rPr>
+              <w:t xml:space="preserve">☐ </w:t>
+            </w:r>
+            <w:r>
+              <w:rPr>
+                <w:sz w:val="16"/>
+              </w:rPr>
+              <w:t xml:space="preserve">Slow polling when the tab is hidden</w:t>
+            </w:r>
+          </w:p>
+          <w:p>
+            <w:pPr>
+              <w:spacing w:after="60"/>
+            </w:pPr>
+            <w:r>
+              <w:rPr>
+                <w:rFonts w:ascii="Segoe UI Symbol" w:hAnsi="Segoe UI Symbol"/>
+                <w:sz w:val="16"/>
+              </w:rPr>
+              <w:t xml:space="preserve">☐ </w:t>
+            </w:r>
+            <w:r>
+              <w:rPr>
+                <w:sz w:val="16"/>
+              </w:rPr>
+              <w:t xml:space="preserve">Make the notifications read path read-only</w:t>
             </w:r>
           </w:p>
         </w:tc>
@@ -7247,14 +7942,74 @@
           </w:tcPr>
           <w:p>
             <w:pPr>
-              <w:spacing w:after="0" w:line="228" w:lineRule="auto"/>
-            </w:pPr>
-            <w:r>
-              <w:rPr>
-                <w:sz w:val="16"/>
-                <w:szCs w:val="16"/>
-              </w:rPr>
-              <w:t xml:space="preserve">Expose metrics (OpenTelemetry/Prometheus) with a dashboard and alerts; tracing per agent turn (roadmap item 12); a k6 load test in CI for chat, approvals and workflows; set targets such as 99.5% uptime and replies under 10 seconds.</w:t>
+              <w:spacing w:after="60"/>
+            </w:pPr>
+            <w:r>
+              <w:rPr>
+                <w:rFonts w:ascii="Segoe UI Symbol" w:hAnsi="Segoe UI Symbol"/>
+                <w:sz w:val="16"/>
+              </w:rPr>
+              <w:t xml:space="preserve">☐ </w:t>
+            </w:r>
+            <w:r>
+              <w:rPr>
+                <w:sz w:val="16"/>
+              </w:rPr>
+              <w:t xml:space="preserve">Expose metrics (OpenTelemetry/Prometheus) with a dashboard and alerts</w:t>
+            </w:r>
+          </w:p>
+          <w:p>
+            <w:pPr>
+              <w:spacing w:after="60"/>
+            </w:pPr>
+            <w:r>
+              <w:rPr>
+                <w:rFonts w:ascii="Segoe UI Symbol" w:hAnsi="Segoe UI Symbol"/>
+                <w:sz w:val="16"/>
+              </w:rPr>
+              <w:t xml:space="preserve">☐ </w:t>
+            </w:r>
+            <w:r>
+              <w:rPr>
+                <w:sz w:val="16"/>
+              </w:rPr>
+              <w:t xml:space="preserve">Tracing per agent turn (roadmap item 12)</w:t>
+            </w:r>
+          </w:p>
+          <w:p>
+            <w:pPr>
+              <w:spacing w:after="60"/>
+            </w:pPr>
+            <w:r>
+              <w:rPr>
+                <w:rFonts w:ascii="Segoe UI Symbol" w:hAnsi="Segoe UI Symbol"/>
+                <w:sz w:val="16"/>
+              </w:rPr>
+              <w:t xml:space="preserve">☐ </w:t>
+            </w:r>
+            <w:r>
+              <w:rPr>
+                <w:sz w:val="16"/>
+              </w:rPr>
+              <w:t xml:space="preserve">A k6 load test in CI for chat, approvals and workflows</w:t>
+            </w:r>
+          </w:p>
+          <w:p>
+            <w:pPr>
+              <w:spacing w:after="60"/>
+            </w:pPr>
+            <w:r>
+              <w:rPr>
+                <w:rFonts w:ascii="Segoe UI Symbol" w:hAnsi="Segoe UI Symbol"/>
+                <w:sz w:val="16"/>
+              </w:rPr>
+              <w:t xml:space="preserve">☐ </w:t>
+            </w:r>
+            <w:r>
+              <w:rPr>
+                <w:sz w:val="16"/>
+              </w:rPr>
+              <w:t xml:space="preserve">Set targets such as 99.5% uptime and replies under 10 seconds</w:t>
             </w:r>
           </w:p>
         </w:tc>
@@ -7406,14 +8161,20 @@
           </w:tcPr>
           <w:p>
             <w:pPr>
-              <w:spacing w:after="0" w:line="228" w:lineRule="auto"/>
-            </w:pPr>
-            <w:r>
-              <w:rPr>
-                <w:sz w:val="16"/>
-                <w:szCs w:val="16"/>
-              </w:rPr>
-              <w:t xml:space="preserve">Alert on these silent failure modes alongside the metrics work in row 11.</w:t>
+              <w:spacing w:after="60"/>
+            </w:pPr>
+            <w:r>
+              <w:rPr>
+                <w:rFonts w:ascii="Segoe UI Symbol" w:hAnsi="Segoe UI Symbol"/>
+                <w:sz w:val="16"/>
+              </w:rPr>
+              <w:t xml:space="preserve">☐ </w:t>
+            </w:r>
+            <w:r>
+              <w:rPr>
+                <w:sz w:val="16"/>
+              </w:rPr>
+              <w:t xml:space="preserve">Alert on these silent failure modes alongside the metrics work in row 11</w:t>
             </w:r>
           </w:p>
         </w:tc>

</xml_diff>

<commit_message>
Fix ZAP baseline findings: CSP on robots.txt and 404s, no-store API responses, tuned rules
</commit_message>
<xml_diff>
--- a/Documents/Nexus Technical Improvements.docx
+++ b/Documents/Nexus Technical Improvements.docx
@@ -4627,7 +4627,7 @@
                 <w:rFonts w:ascii="Segoe UI Symbol" w:hAnsi="Segoe UI Symbol"/>
                 <w:sz w:val="18"/>
               </w:rPr>
-              <w:t xml:space="preserve">☐ </w:t>
+              <w:t xml:space="preserve">☑ </w:t>
             </w:r>
             <w:r>
               <w:rPr>
@@ -4646,7 +4646,7 @@
                 <w:rFonts w:ascii="Segoe UI Symbol" w:hAnsi="Segoe UI Symbol"/>
                 <w:sz w:val="18"/>
               </w:rPr>
-              <w:t xml:space="preserve">☐ </w:t>
+              <w:t xml:space="preserve">☑ </w:t>
             </w:r>
             <w:r>
               <w:rPr>
@@ -4665,7 +4665,7 @@
                 <w:rFonts w:ascii="Segoe UI Symbol" w:hAnsi="Segoe UI Symbol"/>
                 <w:sz w:val="18"/>
               </w:rPr>
-              <w:t xml:space="preserve">☐ </w:t>
+              <w:t xml:space="preserve">☑ </w:t>
             </w:r>
             <w:r>
               <w:rPr>
@@ -4863,6 +4863,25 @@
                 <w:rFonts w:ascii="Segoe UI Symbol" w:hAnsi="Segoe UI Symbol"/>
                 <w:sz w:val="18"/>
               </w:rPr>
+              <w:t xml:space="preserve">☑ </w:t>
+            </w:r>
+            <w:r>
+              <w:rPr>
+                <w:rFonts w:ascii="Arial" w:hAnsi="Arial"/>
+                <w:sz w:val="18"/>
+              </w:rPr>
+              <w:t xml:space="preserve">Add the headers in Caddy and Next.js</w:t>
+            </w:r>
+          </w:p>
+          <w:p>
+            <w:pPr>
+              <w:spacing w:after="60"/>
+            </w:pPr>
+            <w:r>
+              <w:rPr>
+                <w:rFonts w:ascii="Segoe UI Symbol" w:hAnsi="Segoe UI Symbol"/>
+                <w:sz w:val="18"/>
+              </w:rPr>
               <w:t xml:space="preserve">☐ </w:t>
             </w:r>
             <w:r>
@@ -4870,26 +4889,7 @@
                 <w:rFonts w:ascii="Arial" w:hAnsi="Arial"/>
                 <w:sz w:val="18"/>
               </w:rPr>
-              <w:t xml:space="preserve">Add the headers in Caddy and Next.js</w:t>
-            </w:r>
-          </w:p>
-          <w:p>
-            <w:pPr>
-              <w:spacing w:after="60"/>
-            </w:pPr>
-            <w:r>
-              <w:rPr>
-                <w:rFonts w:ascii="Segoe UI Symbol" w:hAnsi="Segoe UI Symbol"/>
-                <w:sz w:val="18"/>
-              </w:rPr>
-              <w:t xml:space="preserve">☐ </w:t>
-            </w:r>
-            <w:r>
-              <w:rPr>
-                <w:rFonts w:ascii="Arial" w:hAnsi="Arial"/>
-                <w:sz w:val="18"/>
-              </w:rPr>
-              <w:t xml:space="preserve">run an OWASP ZAP baseline scan on staging.</w:t>
+              <w:t xml:space="preserve">run an OWASP ZAP baseline scan on staging (workflow, rules and header check are in CI; run it once with the staging URL).</w:t>
             </w:r>
           </w:p>
         </w:tc>

</xml_diff>

<commit_message>
Security scopes 13 and 14: npm audit fix, non-root container, CI security scans, rate limits, daily AI token budget
</commit_message>
<xml_diff>
--- a/Documents/Nexus Technical Improvements.docx
+++ b/Documents/Nexus Technical Improvements.docx
@@ -4882,14 +4882,14 @@
                 <w:rFonts w:ascii="Segoe UI Symbol" w:hAnsi="Segoe UI Symbol"/>
                 <w:sz w:val="18"/>
               </w:rPr>
-              <w:t xml:space="preserve">☐ </w:t>
+              <w:t xml:space="preserve">☑ </w:t>
             </w:r>
             <w:r>
               <w:rPr>
                 <w:rFonts w:ascii="Arial" w:hAnsi="Arial"/>
                 <w:sz w:val="18"/>
               </w:rPr>
-              <w:t xml:space="preserve">run an OWASP ZAP baseline scan on staging (workflow, rules and header check are in CI; run it once with the staging URL).</w:t>
+              <w:t xml:space="preserve">run an OWASP ZAP baseline scan on staging.</w:t>
             </w:r>
           </w:p>
         </w:tc>
@@ -5108,6 +5108,25 @@
                 <w:rFonts w:ascii="Segoe UI Symbol" w:hAnsi="Segoe UI Symbol"/>
                 <w:sz w:val="18"/>
               </w:rPr>
+              <w:t xml:space="preserve">☑ </w:t>
+            </w:r>
+            <w:r>
+              <w:rPr>
+                <w:rFonts w:ascii="Arial" w:hAnsi="Arial"/>
+                <w:sz w:val="18"/>
+              </w:rPr>
+              <w:t xml:space="preserve">npm audit fix</w:t>
+            </w:r>
+          </w:p>
+          <w:p>
+            <w:pPr>
+              <w:spacing w:after="60"/>
+            </w:pPr>
+            <w:r>
+              <w:rPr>
+                <w:rFonts w:ascii="Segoe UI Symbol" w:hAnsi="Segoe UI Symbol"/>
+                <w:sz w:val="18"/>
+              </w:rPr>
               <w:t xml:space="preserve">☐ </w:t>
             </w:r>
             <w:r>
@@ -5115,7 +5134,7 @@
                 <w:rFonts w:ascii="Arial" w:hAnsi="Arial"/>
                 <w:sz w:val="18"/>
               </w:rPr>
-              <w:t xml:space="preserve">npm audit fix</w:t>
+              <w:t xml:space="preserve">pin the image version</w:t>
             </w:r>
           </w:p>
           <w:p>
@@ -5127,14 +5146,14 @@
                 <w:rFonts w:ascii="Segoe UI Symbol" w:hAnsi="Segoe UI Symbol"/>
                 <w:sz w:val="18"/>
               </w:rPr>
-              <w:t xml:space="preserve">☐ </w:t>
+              <w:t xml:space="preserve">☑ </w:t>
             </w:r>
             <w:r>
               <w:rPr>
                 <w:rFonts w:ascii="Arial" w:hAnsi="Arial"/>
                 <w:sz w:val="18"/>
               </w:rPr>
-              <w:t xml:space="preserve">pin the image version</w:t>
+              <w:t xml:space="preserve">run as a non-root user</w:t>
             </w:r>
           </w:p>
           <w:p>
@@ -5146,26 +5165,7 @@
                 <w:rFonts w:ascii="Segoe UI Symbol" w:hAnsi="Segoe UI Symbol"/>
                 <w:sz w:val="18"/>
               </w:rPr>
-              <w:t xml:space="preserve">☐ </w:t>
-            </w:r>
-            <w:r>
-              <w:rPr>
-                <w:rFonts w:ascii="Arial" w:hAnsi="Arial"/>
-                <w:sz w:val="18"/>
-              </w:rPr>
-              <w:t xml:space="preserve">run as a non-root user</w:t>
-            </w:r>
-          </w:p>
-          <w:p>
-            <w:pPr>
-              <w:spacing w:after="60"/>
-            </w:pPr>
-            <w:r>
-              <w:rPr>
-                <w:rFonts w:ascii="Segoe UI Symbol" w:hAnsi="Segoe UI Symbol"/>
-                <w:sz w:val="18"/>
-              </w:rPr>
-              <w:t xml:space="preserve">☐ </w:t>
+              <w:t xml:space="preserve">☑ </w:t>
             </w:r>
             <w:r>
               <w:rPr>
@@ -5331,7 +5331,7 @@
                 <w:rFonts w:ascii="Segoe UI Symbol" w:hAnsi="Segoe UI Symbol"/>
                 <w:sz w:val="18"/>
               </w:rPr>
-              <w:t xml:space="preserve">☐ </w:t>
+              <w:t xml:space="preserve">☑ </w:t>
             </w:r>
             <w:r>
               <w:rPr>
@@ -5350,7 +5350,7 @@
                 <w:rFonts w:ascii="Segoe UI Symbol" w:hAnsi="Segoe UI Symbol"/>
                 <w:sz w:val="18"/>
               </w:rPr>
-              <w:t xml:space="preserve">☐ </w:t>
+              <w:t xml:space="preserve">☑ </w:t>
             </w:r>
             <w:r>
               <w:rPr>

</xml_diff>